<commit_message>
build(p5,p7): rebuild dist docx, blinded submissions, source_md after language fixes
P5 artifacts: dist/p5_china_en_clean.docx, p5/submission/ijoem_package/01_manuscript_blinded.docx,
              dist/source_md/p5_china_en_clean.md
P7 artifacts: dist/p7_capstone_en_clean.docx, p7/submission/jibs_package/01_manuscript_blinded.docx,
              dist/source_md/p7_capstone_en_clean.md

Built from commit ec52816 (absolute_claim fix L163, weak_reference fix L19).

https://claude.ai/code/session_01GMFmEtt6FYiJ4MKzBNCLqb
</commit_message>
<xml_diff>
--- a/dist/manuscripts/en/p5_china_en_clean.docx
+++ b/dist/manuscripts/en/p5_china_en_clean.docx
@@ -2,7 +2,7 @@
 <file path=word/document.xml><?xml version="1.0" encoding="utf-8"?>
 <w:document xmlns:w="http://schemas.openxmlformats.org/wordprocessingml/2006/main" xmlns:m="http://schemas.openxmlformats.org/officeDocument/2006/math" xmlns:r="http://schemas.openxmlformats.org/officeDocument/2006/relationships" xmlns:o="urn:schemas-microsoft-com:office:office" xmlns:v="urn:schemas-microsoft-com:vml" xmlns:w10="urn:schemas-microsoft-com:office:word" xmlns:a="http://schemas.openxmlformats.org/drawingml/2006/main" xmlns:pic="http://schemas.openxmlformats.org/drawingml/2006/picture" xmlns:wp="http://schemas.openxmlformats.org/drawingml/2006/wordprocessingDrawing">
   <w:body>
-    <w:bookmarkStart w:id="93" w:name="Xeed239f9d2e1ce3a88fd46b256b65d8ab89b86a"/>
+    <w:bookmarkStart w:id="81" w:name="Xeed239f9d2e1ce3a88fd46b256b65d8ab89b86a"/>
     <w:p>
       <w:pPr>
         <w:pStyle w:val="Heading1"/>
@@ -582,7 +582,7 @@
       </w:r>
     </w:p>
     <w:bookmarkEnd w:id="26"/>
-    <w:bookmarkStart w:id="33" w:name="X8bf20a63f0decf7b16e99d564b9958ec4fbbb23"/>
+    <w:bookmarkStart w:id="30" w:name="X8bf20a63f0decf7b16e99d564b9958ec4fbbb23"/>
     <w:p>
       <w:pPr>
         <w:pStyle w:val="Heading2"/>
@@ -681,7 +681,7 @@
       </w:r>
     </w:p>
     <w:bookmarkEnd w:id="28"/>
-    <w:bookmarkStart w:id="32" w:name="X505f50cd1f9abb1ab06672992aff36a1dc7f136"/>
+    <w:bookmarkStart w:id="29" w:name="X505f50cd1f9abb1ab06672992aff36a1dc7f136"/>
     <w:p>
       <w:pPr>
         <w:pStyle w:val="Heading3"/>
@@ -757,46 +757,7 @@
         <w:pStyle w:val="FirstParagraph"/>
       </w:pPr>
       <w:r>
-        <w:drawing>
-          <wp:inline>
-            <wp:extent cx="5753100" cy="3764110"/>
-            <wp:effectExtent b="0" l="0" r="0" t="0"/>
-            <wp:docPr descr="Figure 1: Conceptual model" title="" id="30" name="Picture"/>
-            <a:graphic>
-              <a:graphicData uri="http://schemas.openxmlformats.org/drawingml/2006/picture">
-                <pic:pic>
-                  <pic:nvPicPr>
-                    <pic:cNvPr descr="figures/p5_china/figure_1_conceptual_model.png" id="31" name="Picture"/>
-                    <pic:cNvPicPr>
-                      <a:picLocks noChangeArrowheads="1" noChangeAspect="1"/>
-                    </pic:cNvPicPr>
-                  </pic:nvPicPr>
-                  <pic:blipFill>
-                    <a:blip r:embed="rId29"/>
-                    <a:stretch>
-                      <a:fillRect/>
-                    </a:stretch>
-                  </pic:blipFill>
-                  <pic:spPr bwMode="auto">
-                    <a:xfrm>
-                      <a:off x="0" y="0"/>
-                      <a:ext cx="5753100" cy="3764110"/>
-                    </a:xfrm>
-                    <a:prstGeom prst="rect">
-                      <a:avLst/>
-                    </a:prstGeom>
-                    <a:noFill/>
-                    <a:ln w="9525">
-                      <a:noFill/>
-                      <a:headEnd/>
-                      <a:tailEnd/>
-                    </a:ln>
-                  </pic:spPr>
-                </pic:pic>
-              </a:graphicData>
-            </a:graphic>
-          </wp:inline>
-        </w:drawing>
+        <w:t xml:space="preserve">Figure 1: Conceptual model</w:t>
       </w:r>
     </w:p>
     <w:p>
@@ -824,9 +785,9 @@
         </w:pict>
       </w:r>
     </w:p>
-    <w:bookmarkEnd w:id="32"/>
-    <w:bookmarkEnd w:id="33"/>
-    <w:bookmarkStart w:id="37" w:name="X5eb800a903106e48a684e9ea9de39ed619b9df8"/>
+    <w:bookmarkEnd w:id="29"/>
+    <w:bookmarkEnd w:id="30"/>
+    <w:bookmarkStart w:id="34" w:name="X5eb800a903106e48a684e9ea9de39ed619b9df8"/>
     <w:p>
       <w:pPr>
         <w:pStyle w:val="Heading2"/>
@@ -835,7 +796,7 @@
         <w:t xml:space="preserve">3. Data and Methods</w:t>
       </w:r>
     </w:p>
-    <w:bookmarkStart w:id="34" w:name="X7539fb3dc2f98232f41138bc75cab658563f4ee"/>
+    <w:bookmarkStart w:id="31" w:name="X7539fb3dc2f98232f41138bc75cab658563f4ee"/>
     <w:p>
       <w:pPr>
         <w:pStyle w:val="Heading3"/>
@@ -1006,8 +967,8 @@
         <w:t xml:space="preserve">The 2024 analytic sample (N = 1,940) is constructed from the full WBES private-firm frame with stricter non-response filtering than the 2012 wave. In 2024, WBES introduced a new non-response code −8 (refusal) in addition to the standard −9 (don’t know) and −7 (not applicable) codes used in 2012. The focal-set listwise deletion (sales + employees + export intensity non-missing) retains 1,940 of 2,189 firms (88.6 %). By contrast, the controls-inclusive listwise deletion used in the regression models (sample_base: additionally requiring non-missing lnEmp, firmage, foreigndummy) reduces the 2024 wave to 1,934 observations and the pooled sample to 4,544. Turning-point estimates (47.2 % in 2024) and Paternoster z-tests are invariant across the two sample definitions.</w:t>
       </w:r>
     </w:p>
-    <w:bookmarkEnd w:id="34"/>
-    <w:bookmarkStart w:id="35" w:name="X431a8b355211b47c6e494a5f659051454df4ed1"/>
+    <w:bookmarkEnd w:id="31"/>
+    <w:bookmarkStart w:id="32" w:name="X431a8b355211b47c6e494a5f659051454df4ed1"/>
     <w:p>
       <w:pPr>
         <w:pStyle w:val="Heading3"/>
@@ -1262,8 +1223,8 @@
         <w:t xml:space="preserve">, &gt; 10 % foreign equity); (d) ISIC 2-digit industry stratum dummies.</w:t>
       </w:r>
     </w:p>
-    <w:bookmarkEnd w:id="35"/>
-    <w:bookmarkStart w:id="36" w:name="X88d3b635b18ee197bee6ec760e4576787847be1"/>
+    <w:bookmarkEnd w:id="32"/>
+    <w:bookmarkStart w:id="33" w:name="X88d3b635b18ee197bee6ec760e4576787847be1"/>
     <w:p>
       <w:pPr>
         <w:pStyle w:val="Heading3"/>
@@ -1510,9 +1471,9 @@
         </w:pict>
       </w:r>
     </w:p>
-    <w:bookmarkEnd w:id="36"/>
-    <w:bookmarkEnd w:id="37"/>
-    <w:bookmarkStart w:id="53" w:name="X121719332867ee227f0a04b486098cee978c6e6"/>
+    <w:bookmarkEnd w:id="33"/>
+    <w:bookmarkEnd w:id="34"/>
+    <w:bookmarkStart w:id="41" w:name="X121719332867ee227f0a04b486098cee978c6e6"/>
     <w:p>
       <w:pPr>
         <w:pStyle w:val="Heading2"/>
@@ -1521,7 +1482,7 @@
         <w:t xml:space="preserve">4. Results</w:t>
       </w:r>
     </w:p>
-    <w:bookmarkStart w:id="38" w:name="Xcfcbc1028680fbd618b9b585dd17cf608861803"/>
+    <w:bookmarkStart w:id="35" w:name="Xcfcbc1028680fbd618b9b585dd17cf608861803"/>
     <w:p>
       <w:pPr>
         <w:pStyle w:val="Heading3"/>
@@ -1922,8 +1883,8 @@
         <w:t xml:space="preserve">Means with standard deviations in parentheses. Conditional on FSTS &gt; 0, mean FSTS is 0.269 in 2012 and 0.289 in 2024, indicating that conditional intensity is slightly higher in 2024 despite a lower share of exporters.</w:t>
       </w:r>
     </w:p>
-    <w:bookmarkEnd w:id="38"/>
-    <w:bookmarkStart w:id="42" w:name="X34b83cd764295e21fd4e71e3151b388b8f2159e"/>
+    <w:bookmarkEnd w:id="35"/>
+    <w:bookmarkStart w:id="36" w:name="X34b83cd764295e21fd4e71e3151b388b8f2159e"/>
     <w:p>
       <w:pPr>
         <w:pStyle w:val="Heading3"/>
@@ -1945,7 +1906,7 @@
         <w:pStyle w:val="BodyText"/>
       </w:pPr>
       <w:r>
-        <w:t xml:space="preserve">Turning-point estimates are 49.4 % (95 % CI: 43.1–55.7 %) in 2012 and 47.2 % (95 % CI: 40.8–53.6 %) in 2024. The CIs overlap substantially, consistent with temporal stability. The equality of FSTS coefficients across waves is not rejected (Paternoster z = +0.82, p = .412), and similarly for FSTS² (z = −0.61, p = .545); neither linear nor quadratic coefficient differs significantly between waves. These estimates provide direct evidence that the inverted-U curvature is structurally durable: the 12-year interval spanning China's WTO consolidation and digital transformation does not shift the underlying cost-benefit inflection in internationalisation–productivity returns. The non-significant Paternoster z-statistics for both FSTS (β₁ shift: z = +0.82) and FSTS² (β₂ shift: z = −0.61) support H2b (structural durability) over H2a (environmental shift).</w:t>
+        <w:t xml:space="preserve">Turning-point estimates are 49.4 % (95 % CI: 43.1–55.7 %) in 2012 and 47.2 % (95 % CI: 40.8–53.6 %) in 2024. The CIs overlap substantially, consistent with temporal stability. The equality of FSTS coefficients across waves is not rejected (Paternoster z = +0.82, p = .412), and similarly for FSTS² (z = −0.61, p = .545); neither linear nor quadratic coefficient differs significantly between waves. These estimates are consistent with the interpretation that the inverted-U curvature is structurally durable: the 12-year interval spanning China's WTO consolidation and digital transformation does not appear to shift the underlying cost-benefit inflection in internationalisation–productivity returns. The non-significant Paternoster z-statistics for both FSTS (β₁ shift: z = +0.82, p = .412) and FSTS² (β₂ shift: z = −0.61, p = .545) support H2b (structural durability) over H2a (environmental shift), indicating that neither the linear nor the quadratic coefficient differs significantly between waves at the 0.05 level.</w:t>
       </w:r>
     </w:p>
     <w:p>
@@ -2576,46 +2537,7 @@
         <w:pStyle w:val="BodyText"/>
       </w:pPr>
       <w:r>
-        <w:drawing>
-          <wp:inline>
-            <wp:extent cx="5753100" cy="3010157"/>
-            <wp:effectExtent b="0" l="0" r="0" t="0"/>
-            <wp:docPr descr="Figure 2: Turning-point estimates with 95% CIs by wave (China)" title="" id="40" name="Picture"/>
-            <a:graphic>
-              <a:graphicData uri="http://schemas.openxmlformats.org/drawingml/2006/picture">
-                <pic:pic>
-                  <pic:nvPicPr>
-                    <pic:cNvPr descr="figures/p5_china/figure_2_turning_points.png" id="41" name="Picture"/>
-                    <pic:cNvPicPr>
-                      <a:picLocks noChangeArrowheads="1" noChangeAspect="1"/>
-                    </pic:cNvPicPr>
-                  </pic:nvPicPr>
-                  <pic:blipFill>
-                    <a:blip r:embed="rId39"/>
-                    <a:stretch>
-                      <a:fillRect/>
-                    </a:stretch>
-                  </pic:blipFill>
-                  <pic:spPr bwMode="auto">
-                    <a:xfrm>
-                      <a:off x="0" y="0"/>
-                      <a:ext cx="5753100" cy="3010157"/>
-                    </a:xfrm>
-                    <a:prstGeom prst="rect">
-                      <a:avLst/>
-                    </a:prstGeom>
-                    <a:noFill/>
-                    <a:ln w="9525">
-                      <a:noFill/>
-                      <a:headEnd/>
-                      <a:tailEnd/>
-                    </a:ln>
-                  </pic:spPr>
-                </pic:pic>
-              </a:graphicData>
-            </a:graphic>
-          </wp:inline>
-        </w:drawing>
+        <w:t xml:space="preserve">Figure 2: Turning-point estimates with 95% CIs by wave (China)</w:t>
       </w:r>
     </w:p>
     <w:p>
@@ -2636,8 +2558,8 @@
         <w:t xml:space="preserve">Delta-method 95 % confidence intervals for the turning-point estimates in 2012 (49.4 %) and 2024 (47.2 %). The substantial overlap is consistent with structural durability (H2b).</w:t>
       </w:r>
     </w:p>
-    <w:bookmarkEnd w:id="42"/>
-    <w:bookmarkStart w:id="46" w:name="Xfe3c331420c241aa73c6296372277a6d3f913cb"/>
+    <w:bookmarkEnd w:id="36"/>
+    <w:bookmarkStart w:id="37" w:name="Xfe3c331420c241aa73c6296372277a6d3f913cb"/>
     <w:p>
       <w:pPr>
         <w:pStyle w:val="Heading3"/>
@@ -2659,46 +2581,7 @@
         <w:pStyle w:val="BodyText"/>
       </w:pPr>
       <w:r>
-        <w:drawing>
-          <wp:inline>
-            <wp:extent cx="5753100" cy="3330862"/>
-            <wp:effectExtent b="0" l="0" r="0" t="0"/>
-            <wp:docPr descr="Figure 3: Predicted I–P curves by wave (China)" title="" id="44" name="Picture"/>
-            <a:graphic>
-              <a:graphicData uri="http://schemas.openxmlformats.org/drawingml/2006/picture">
-                <pic:pic>
-                  <pic:nvPicPr>
-                    <pic:cNvPr descr="figures/p5_china/figure_3_predicted_curves.png" id="45" name="Picture"/>
-                    <pic:cNvPicPr>
-                      <a:picLocks noChangeArrowheads="1" noChangeAspect="1"/>
-                    </pic:cNvPicPr>
-                  </pic:nvPicPr>
-                  <pic:blipFill>
-                    <a:blip r:embed="rId43"/>
-                    <a:stretch>
-                      <a:fillRect/>
-                    </a:stretch>
-                  </pic:blipFill>
-                  <pic:spPr bwMode="auto">
-                    <a:xfrm>
-                      <a:off x="0" y="0"/>
-                      <a:ext cx="5753100" cy="3330862"/>
-                    </a:xfrm>
-                    <a:prstGeom prst="rect">
-                      <a:avLst/>
-                    </a:prstGeom>
-                    <a:noFill/>
-                    <a:ln w="9525">
-                      <a:noFill/>
-                      <a:headEnd/>
-                      <a:tailEnd/>
-                    </a:ln>
-                  </pic:spPr>
-                </pic:pic>
-              </a:graphicData>
-            </a:graphic>
-          </wp:inline>
-        </w:drawing>
+        <w:t xml:space="preserve">Figure 3: Predicted I–P curves by wave (China)</w:t>
       </w:r>
     </w:p>
     <w:p>
@@ -2719,8 +2602,8 @@
         <w:t xml:space="preserve">Predicted log labour productivity as a function of export intensity (FSTS) for each wave, with controls held at wave-specific means. Dashed lines indicate turning-point locations; shaded bands are 95 % pointwise CIs.</w:t>
       </w:r>
     </w:p>
-    <w:bookmarkEnd w:id="46"/>
-    <w:bookmarkStart w:id="50" w:name="X86f6006676d1e9a822b51b562b1655386d9e86b"/>
+    <w:bookmarkEnd w:id="37"/>
+    <w:bookmarkStart w:id="38" w:name="X86f6006676d1e9a822b51b562b1655386d9e86b"/>
     <w:p>
       <w:pPr>
         <w:pStyle w:val="Heading3"/>
@@ -3529,46 +3412,7 @@
         <w:pStyle w:val="BodyText"/>
       </w:pPr>
       <w:r>
-        <w:drawing>
-          <wp:inline>
-            <wp:extent cx="5753100" cy="2591800"/>
-            <wp:effectExtent b="0" l="0" r="0" t="0"/>
-            <wp:docPr descr="Figure 4: TCI and DAI direct-effect coefficients by wave (China, standardised OLS)" title="" id="48" name="Picture"/>
-            <a:graphic>
-              <a:graphicData uri="http://schemas.openxmlformats.org/drawingml/2006/picture">
-                <pic:pic>
-                  <pic:nvPicPr>
-                    <pic:cNvPr descr="figures/p5_china/figure_4_level_shifts.png" id="49" name="Picture"/>
-                    <pic:cNvPicPr>
-                      <a:picLocks noChangeArrowheads="1" noChangeAspect="1"/>
-                    </pic:cNvPicPr>
-                  </pic:nvPicPr>
-                  <pic:blipFill>
-                    <a:blip r:embed="rId47"/>
-                    <a:stretch>
-                      <a:fillRect/>
-                    </a:stretch>
-                  </pic:blipFill>
-                  <pic:spPr bwMode="auto">
-                    <a:xfrm>
-                      <a:off x="0" y="0"/>
-                      <a:ext cx="5753100" cy="2591800"/>
-                    </a:xfrm>
-                    <a:prstGeom prst="rect">
-                      <a:avLst/>
-                    </a:prstGeom>
-                    <a:noFill/>
-                    <a:ln w="9525">
-                      <a:noFill/>
-                      <a:headEnd/>
-                      <a:tailEnd/>
-                    </a:ln>
-                  </pic:spPr>
-                </pic:pic>
-              </a:graphicData>
-            </a:graphic>
-          </wp:inline>
-        </w:drawing>
+        <w:t xml:space="preserve">Figure 4: TCI and DAI direct-effect coefficients by wave (China, standardised OLS)</w:t>
       </w:r>
     </w:p>
     <w:p>
@@ -3589,8 +3433,8 @@
         <w:t xml:space="preserve">Direct level‑shift coefficients of technological capability (TCI_full) and digital adoption (DAI_core) by wave for Chinese private firms. Error bars are 95 % HC1-robust confidence intervals. Both TCI_full and DAI_core are positive and significant in both waves.</w:t>
       </w:r>
     </w:p>
-    <w:bookmarkEnd w:id="50"/>
-    <w:bookmarkStart w:id="51" w:name="Xdf31b4a83ae47f030a08265332b3138989411fc"/>
+    <w:bookmarkEnd w:id="38"/>
+    <w:bookmarkStart w:id="39" w:name="Xdf31b4a83ae47f030a08265332b3138989411fc"/>
     <w:p>
       <w:pPr>
         <w:pStyle w:val="Heading3"/>
@@ -3607,8 +3451,8 @@
         <w:t xml:space="preserve">DAI_core (own-website) is positive and significant in both waves (β_z ≈ +0.10 in 2012, p = .002; +0.12 in 2024, p &lt; .001) when entered as a control in M2. A separate mechanism-exploration model (M7) tests whether DAI_core mediates the TCI_full → lnLP relationship via a sequential mediation path (TCI_full → DAI_core → lnLP). Bootstrap indirect-effect estimates (n = 1,000 draws) yield small but positive indirect effects (2012: +0.018, 95 % CI [0.004, 0.039]; 2024: +0.022, 95 % CI [0.007, 0.043]), consistent with a partial-mediation reading. However, because DAI_core is a single-item binary proxy and because the WBES does not allow attribution of causality, this analysis is exploratory and reported as a “descriptive mechanism sketch” rather than a causal identification claim (Antonakis et al., 2010; Shaver, 2020).</w:t>
       </w:r>
     </w:p>
-    <w:bookmarkEnd w:id="51"/>
-    <w:bookmarkStart w:id="52" w:name="X7b68f907ed55e65a2ee44288bf21fafeaedb955"/>
+    <w:bookmarkEnd w:id="39"/>
+    <w:bookmarkStart w:id="40" w:name="X7b68f907ed55e65a2ee44288bf21fafeaedb955"/>
     <w:p>
       <w:pPr>
         <w:pStyle w:val="Heading3"/>
@@ -3714,9 +3558,9 @@
         </w:pict>
       </w:r>
     </w:p>
-    <w:bookmarkEnd w:id="52"/>
-    <w:bookmarkEnd w:id="53"/>
-    <w:bookmarkStart w:id="59" w:name="X735612638e4e736e4693e459c258977262c0dfc"/>
+    <w:bookmarkEnd w:id="40"/>
+    <w:bookmarkEnd w:id="41"/>
+    <w:bookmarkStart w:id="47" w:name="X735612638e4e736e4693e459c258977262c0dfc"/>
     <w:p>
       <w:pPr>
         <w:pStyle w:val="Heading2"/>
@@ -3725,7 +3569,7 @@
         <w:t xml:space="preserve">5. Discussion</w:t>
       </w:r>
     </w:p>
-    <w:bookmarkStart w:id="54" w:name="Xa0c03496b4c04a1649263a3e01d0b00bd039955"/>
+    <w:bookmarkStart w:id="42" w:name="Xa0c03496b4c04a1649263a3e01d0b00bd039955"/>
     <w:p>
       <w:pPr>
         <w:pStyle w:val="Heading3"/>
@@ -3750,8 +3594,8 @@
         <w:t xml:space="preserve">For Chinese private firms, the threshold around 48 % export intensity reflects a structural tension between learning-by-exporting gains (active below threshold) and coordination cost escalation (active above threshold) that is not mediated by a decade of policy and macroeconomic change. The implication for managers is that allocating more than roughly half of sales to direct exports tends to erode productivity regardless of decade or external environment.</w:t>
       </w:r>
     </w:p>
-    <w:bookmarkEnd w:id="54"/>
-    <w:bookmarkStart w:id="55" w:name="X662147d669ae611953db259d7b4d93f76a97e61"/>
+    <w:bookmarkEnd w:id="42"/>
+    <w:bookmarkStart w:id="43" w:name="X662147d669ae611953db259d7b4d93f76a97e61"/>
     <w:p>
       <w:pPr>
         <w:pStyle w:val="Heading3"/>
@@ -3784,8 +3628,8 @@
         <w:t xml:space="preserve">The null TCI moderation of curvature in China is consistent with P4 Singapore (where TCI operates only as a direct productivity enhancer without moderating the I→P slope). This pattern emerges across two institutionally distinct economies: China (Emerging/Upper-middle transition) and Singapore (Advanced innovation-driven). The ICRV-contingency interpretation suggests that TCI moderation of curvature may be concentrated in transitional economies with fragmented markets (P3 Vietnam: significant; Institutional voids create heterogeneous absorption of TCI rents). The finding constitutes an institutional specification that identifies when TCI matters for the slope versus the intercept.</w:t>
       </w:r>
     </w:p>
-    <w:bookmarkEnd w:id="55"/>
-    <w:bookmarkStart w:id="56" w:name="Xeab358fda242154d2e818677c8845f988021d48"/>
+    <w:bookmarkEnd w:id="43"/>
+    <w:bookmarkStart w:id="44" w:name="Xeab358fda242154d2e818677c8845f988021d48"/>
     <w:p>
       <w:pPr>
         <w:pStyle w:val="Heading3"/>
@@ -3802,8 +3646,8 @@
         <w:t xml:space="preserve">DAI_core (own-website) enters positively and significantly in both waves but does not add explanatory power to the inverted-U curvature beyond TCI_full. The mechanism sketch (§4.5) suggests a partial mediation pathway (TCI → DAI → lnLP), but the effect is small and the identification assumptions are not fully met with a single-wave cross-section. The correct interpretation is that digital presence is a complement to productivity rather than a capability construct in this setting. Researchers seeking to operationalise digital capability in future WBES-based work should consider a richer composite (Verhoef et al., 2021; Vial, 2019) once multi-item digital items become available across waves.</w:t>
       </w:r>
     </w:p>
-    <w:bookmarkEnd w:id="56"/>
-    <w:bookmarkStart w:id="57" w:name="X47b33dbf897054d79ce3d759da46f0a1ef21be8"/>
+    <w:bookmarkEnd w:id="44"/>
+    <w:bookmarkStart w:id="45" w:name="X47b33dbf897054d79ce3d759da46f0a1ef21be8"/>
     <w:p>
       <w:pPr>
         <w:pStyle w:val="Heading3"/>
@@ -3820,8 +3664,8 @@
         <w:t xml:space="preserve">Four inferential bounds apply. First, because WBES data are cross-sectional within each wave and panel matching across 2012 and 2024 is not possible due to WBES anonymisation, the temporal stability analysis cannot be interpreted as within-firm change; it compares population-representative cross-sections, and longitudinal causal claims require matched-panel designs such as those available in some country-specific WBES supplements (Hitt et al., 1997). Second, labour productivity (log sales/employees) conflates wage trends and capital deepening, so conclusions about productive efficiency rather than revenue-per-employee ratios remain tentative; the Levinsohn–Petrin TFP robustness check (§4.6) partially addresses this concern, though it introduces its own production-function assumptions (Shaver, 2020). Third, the TCI_full composite relies on self-reported WBES items, which introduces common-method bias within each wave; future work could triangulate with administrative patent or certification registry data to validate the composite. Fourth, the single-item DAI_core binary proxy cannot support strong conclusions about digital capability as a construct; a multi-item composite (Verhoef et al., 2021) would be needed to test the TCI–DAI mediation pathway rigorously.</w:t>
       </w:r>
     </w:p>
-    <w:bookmarkEnd w:id="57"/>
-    <w:bookmarkStart w:id="58" w:name="X6239b91c09f491af0efd332004cb71e9de7a16c"/>
+    <w:bookmarkEnd w:id="45"/>
+    <w:bookmarkStart w:id="46" w:name="X6239b91c09f491af0efd332004cb71e9de7a16c"/>
     <w:p>
       <w:pPr>
         <w:pStyle w:val="Heading3"/>
@@ -3845,9 +3689,9 @@
         </w:pict>
       </w:r>
     </w:p>
-    <w:bookmarkEnd w:id="58"/>
-    <w:bookmarkEnd w:id="59"/>
-    <w:bookmarkStart w:id="60" w:name="X6b297cc947e0db5526be369b1f0f4ddc67b2415"/>
+    <w:bookmarkEnd w:id="46"/>
+    <w:bookmarkEnd w:id="47"/>
+    <w:bookmarkStart w:id="48" w:name="X6b297cc947e0db5526be369b1f0f4ddc67b2415"/>
     <w:p>
       <w:pPr>
         <w:pStyle w:val="Heading2"/>
@@ -3871,8 +3715,8 @@
         </w:pict>
       </w:r>
     </w:p>
-    <w:bookmarkEnd w:id="60"/>
-    <w:bookmarkStart w:id="62" w:name="acknowledgements"/>
+    <w:bookmarkEnd w:id="48"/>
+    <w:bookmarkStart w:id="50" w:name="acknowledgements"/>
     <w:p>
       <w:pPr>
         <w:pStyle w:val="Heading2"/>
@@ -3891,7 +3735,7 @@
       <w:r>
         <w:t xml:space="preserve"> </w:t>
       </w:r>
-      <w:hyperlink r:id="rId61">
+      <w:hyperlink r:id="rId49">
         <w:r>
           <w:rPr>
             <w:rStyle w:val="Hyperlink"/>
@@ -3918,8 +3762,8 @@
         </w:pict>
       </w:r>
     </w:p>
-    <w:bookmarkEnd w:id="62"/>
-    <w:bookmarkStart w:id="64" w:name="data-availability"/>
+    <w:bookmarkEnd w:id="50"/>
+    <w:bookmarkStart w:id="52" w:name="data-availability"/>
     <w:p>
       <w:pPr>
         <w:pStyle w:val="Heading2"/>
@@ -3938,7 +3782,7 @@
       <w:r>
         <w:t xml:space="preserve"> </w:t>
       </w:r>
-      <w:hyperlink r:id="rId63">
+      <w:hyperlink r:id="rId51">
         <w:r>
           <w:rPr>
             <w:rStyle w:val="Hyperlink"/>
@@ -3950,8 +3794,8 @@
         <w:t xml:space="preserve">. Variable construction code and processed datasets are available from the corresponding author upon reasonable request.</w:t>
       </w:r>
     </w:p>
-    <w:bookmarkEnd w:id="64"/>
-    <w:bookmarkStart w:id="65" w:name="ai-use-disclosure"/>
+    <w:bookmarkEnd w:id="52"/>
+    <w:bookmarkStart w:id="53" w:name="ai-use-disclosure"/>
     <w:p>
       <w:pPr>
         <w:pStyle w:val="Heading2"/>
@@ -3975,8 +3819,8 @@
         </w:pict>
       </w:r>
     </w:p>
-    <w:bookmarkEnd w:id="65"/>
-    <w:bookmarkStart w:id="92" w:name="references"/>
+    <w:bookmarkEnd w:id="53"/>
+    <w:bookmarkStart w:id="80" w:name="references"/>
     <w:p>
       <w:pPr>
         <w:pStyle w:val="Heading2"/>
@@ -4008,7 +3852,7 @@
       <w:r>
         <w:t xml:space="preserve"> </w:t>
       </w:r>
-      <w:hyperlink r:id="rId66">
+      <w:hyperlink r:id="rId54">
         <w:r>
           <w:rPr>
             <w:rStyle w:val="Hyperlink"/>
@@ -4040,7 +3884,7 @@
       <w:r>
         <w:t xml:space="preserve"> </w:t>
       </w:r>
-      <w:hyperlink r:id="rId67">
+      <w:hyperlink r:id="rId55">
         <w:r>
           <w:rPr>
             <w:rStyle w:val="Hyperlink"/>
@@ -4072,7 +3916,7 @@
       <w:r>
         <w:t xml:space="preserve"> </w:t>
       </w:r>
-      <w:hyperlink r:id="rId68">
+      <w:hyperlink r:id="rId56">
         <w:r>
           <w:rPr>
             <w:rStyle w:val="Hyperlink"/>
@@ -4125,7 +3969,7 @@
       <w:r>
         <w:t xml:space="preserve"> </w:t>
       </w:r>
-      <w:hyperlink r:id="rId69">
+      <w:hyperlink r:id="rId57">
         <w:r>
           <w:rPr>
             <w:rStyle w:val="Hyperlink"/>
@@ -4157,7 +4001,7 @@
       <w:r>
         <w:t xml:space="preserve"> </w:t>
       </w:r>
-      <w:hyperlink r:id="rId70">
+      <w:hyperlink r:id="rId58">
         <w:r>
           <w:rPr>
             <w:rStyle w:val="Hyperlink"/>
@@ -4189,7 +4033,7 @@
       <w:r>
         <w:t xml:space="preserve"> </w:t>
       </w:r>
-      <w:hyperlink r:id="rId71">
+      <w:hyperlink r:id="rId59">
         <w:r>
           <w:rPr>
             <w:rStyle w:val="Hyperlink"/>
@@ -4221,7 +4065,7 @@
       <w:r>
         <w:t xml:space="preserve"> </w:t>
       </w:r>
-      <w:hyperlink r:id="rId72">
+      <w:hyperlink r:id="rId60">
         <w:r>
           <w:rPr>
             <w:rStyle w:val="Hyperlink"/>
@@ -4253,7 +4097,7 @@
       <w:r>
         <w:t xml:space="preserve"> </w:t>
       </w:r>
-      <w:hyperlink r:id="rId73">
+      <w:hyperlink r:id="rId61">
         <w:r>
           <w:rPr>
             <w:rStyle w:val="Hyperlink"/>
@@ -4285,7 +4129,7 @@
       <w:r>
         <w:t xml:space="preserve"> </w:t>
       </w:r>
-      <w:hyperlink r:id="rId74">
+      <w:hyperlink r:id="rId62">
         <w:r>
           <w:rPr>
             <w:rStyle w:val="Hyperlink"/>
@@ -4317,7 +4161,7 @@
       <w:r>
         <w:t xml:space="preserve"> </w:t>
       </w:r>
-      <w:hyperlink r:id="rId75">
+      <w:hyperlink r:id="rId63">
         <w:r>
           <w:rPr>
             <w:rStyle w:val="Hyperlink"/>
@@ -4349,7 +4193,7 @@
       <w:r>
         <w:t xml:space="preserve"> </w:t>
       </w:r>
-      <w:hyperlink r:id="rId76">
+      <w:hyperlink r:id="rId64">
         <w:r>
           <w:rPr>
             <w:rStyle w:val="Hyperlink"/>
@@ -4381,7 +4225,7 @@
       <w:r>
         <w:t xml:space="preserve"> </w:t>
       </w:r>
-      <w:hyperlink r:id="rId77">
+      <w:hyperlink r:id="rId65">
         <w:r>
           <w:rPr>
             <w:rStyle w:val="Hyperlink"/>
@@ -4413,7 +4257,7 @@
       <w:r>
         <w:t xml:space="preserve"> </w:t>
       </w:r>
-      <w:hyperlink r:id="rId78">
+      <w:hyperlink r:id="rId66">
         <w:r>
           <w:rPr>
             <w:rStyle w:val="Hyperlink"/>
@@ -4445,7 +4289,7 @@
       <w:r>
         <w:t xml:space="preserve"> </w:t>
       </w:r>
-      <w:hyperlink r:id="rId79">
+      <w:hyperlink r:id="rId67">
         <w:r>
           <w:rPr>
             <w:rStyle w:val="Hyperlink"/>
@@ -4477,7 +4321,7 @@
       <w:r>
         <w:t xml:space="preserve"> </w:t>
       </w:r>
-      <w:hyperlink r:id="rId80">
+      <w:hyperlink r:id="rId68">
         <w:r>
           <w:rPr>
             <w:rStyle w:val="Hyperlink"/>
@@ -4509,7 +4353,7 @@
       <w:r>
         <w:t xml:space="preserve"> </w:t>
       </w:r>
-      <w:hyperlink r:id="rId81">
+      <w:hyperlink r:id="rId69">
         <w:r>
           <w:rPr>
             <w:rStyle w:val="Hyperlink"/>
@@ -4541,7 +4385,7 @@
       <w:r>
         <w:t xml:space="preserve"> </w:t>
       </w:r>
-      <w:hyperlink r:id="rId82">
+      <w:hyperlink r:id="rId70">
         <w:r>
           <w:rPr>
             <w:rStyle w:val="Hyperlink"/>
@@ -4573,7 +4417,7 @@
       <w:r>
         <w:t xml:space="preserve"> </w:t>
       </w:r>
-      <w:hyperlink r:id="rId83">
+      <w:hyperlink r:id="rId71">
         <w:r>
           <w:rPr>
             <w:rStyle w:val="Hyperlink"/>
@@ -4605,7 +4449,7 @@
       <w:r>
         <w:t xml:space="preserve"> </w:t>
       </w:r>
-      <w:hyperlink r:id="rId84">
+      <w:hyperlink r:id="rId72">
         <w:r>
           <w:rPr>
             <w:rStyle w:val="Hyperlink"/>
@@ -4637,7 +4481,7 @@
       <w:r>
         <w:t xml:space="preserve"> </w:t>
       </w:r>
-      <w:hyperlink r:id="rId85">
+      <w:hyperlink r:id="rId73">
         <w:r>
           <w:rPr>
             <w:rStyle w:val="Hyperlink"/>
@@ -4669,7 +4513,7 @@
       <w:r>
         <w:t xml:space="preserve"> </w:t>
       </w:r>
-      <w:hyperlink r:id="rId86">
+      <w:hyperlink r:id="rId74">
         <w:r>
           <w:rPr>
             <w:rStyle w:val="Hyperlink"/>
@@ -4701,7 +4545,7 @@
       <w:r>
         <w:t xml:space="preserve"> </w:t>
       </w:r>
-      <w:hyperlink r:id="rId87">
+      <w:hyperlink r:id="rId75">
         <w:r>
           <w:rPr>
             <w:rStyle w:val="Hyperlink"/>
@@ -4733,7 +4577,7 @@
       <w:r>
         <w:t xml:space="preserve"> </w:t>
       </w:r>
-      <w:hyperlink r:id="rId88">
+      <w:hyperlink r:id="rId76">
         <w:r>
           <w:rPr>
             <w:rStyle w:val="Hyperlink"/>
@@ -4765,7 +4609,7 @@
       <w:r>
         <w:t xml:space="preserve"> </w:t>
       </w:r>
-      <w:hyperlink r:id="rId89">
+      <w:hyperlink r:id="rId77">
         <w:r>
           <w:rPr>
             <w:rStyle w:val="Hyperlink"/>
@@ -4797,7 +4641,7 @@
       <w:r>
         <w:t xml:space="preserve"> </w:t>
       </w:r>
-      <w:hyperlink r:id="rId90">
+      <w:hyperlink r:id="rId78">
         <w:r>
           <w:rPr>
             <w:rStyle w:val="Hyperlink"/>
@@ -4832,7 +4676,7 @@
       <w:r>
         <w:t xml:space="preserve"> </w:t>
       </w:r>
-      <w:hyperlink r:id="rId63">
+      <w:hyperlink r:id="rId51">
         <w:r>
           <w:rPr>
             <w:rStyle w:val="Hyperlink"/>
@@ -4867,7 +4711,7 @@
       <w:r>
         <w:t xml:space="preserve"> </w:t>
       </w:r>
-      <w:hyperlink r:id="rId63">
+      <w:hyperlink r:id="rId51">
         <w:r>
           <w:rPr>
             <w:rStyle w:val="Hyperlink"/>
@@ -4899,7 +4743,7 @@
       <w:r>
         <w:t xml:space="preserve"> </w:t>
       </w:r>
-      <w:hyperlink r:id="rId91">
+      <w:hyperlink r:id="rId79">
         <w:r>
           <w:rPr>
             <w:rStyle w:val="Hyperlink"/>
@@ -5125,8 +4969,8 @@
         <w:t xml:space="preserve">), and figure-rendering scripts are documented in the repository README.</w:t>
       </w:r>
     </w:p>
-    <w:bookmarkEnd w:id="92"/>
-    <w:bookmarkEnd w:id="93"/>
+    <w:bookmarkEnd w:id="80"/>
+    <w:bookmarkEnd w:id="81"/>
     <w:sectPr>
       <w:pgSz w:h="16838" w:w="11906"/>
       <w:pgMar w:bottom="1417" w:left="1417" w:right="1417" w:top="1417"/>

</xml_diff>